<commit_message>
Assignment 4: Automatic EBS Snapshot and Cleanup Using AWS Lambda and Boto3 completed.
</commit_message>
<xml_diff>
--- a/Assignment-4_Automatic_EBS_Snapshot_Cleanup/Assignment4_Screenshots.docx
+++ b/Assignment-4_Automatic_EBS_Snapshot_Cleanup/Assignment4_Screenshots.docx
@@ -30,13 +30,59 @@
     </w:p>
     <w:p>
       <w:r>
-        <w:t>S</w:t>
-      </w:r>
-      <w:r>
-        <w:t>creenshot</w:t>
-      </w:r>
-      <w:r>
-        <w:t xml:space="preserve"> 2: Security Profile Verification</w:t>
+        <w:rPr>
+          <w:b/>
+          <w:bCs/>
+          <w:noProof/>
+        </w:rPr>
+        <w:drawing>
+          <wp:inline distT="0" distB="0" distL="0" distR="0" wp14:anchorId="773D6EA5" wp14:editId="0ACA9BFE">
+            <wp:extent cx="5721985" cy="2417445"/>
+            <wp:effectExtent l="0" t="0" r="0" b="1905"/>
+            <wp:docPr id="406816940" name="Picture 1"/>
+            <wp:cNvGraphicFramePr>
+              <a:graphicFrameLocks xmlns:a="http://schemas.openxmlformats.org/drawingml/2006/main" noChangeAspect="1"/>
+            </wp:cNvGraphicFramePr>
+            <a:graphic xmlns:a="http://schemas.openxmlformats.org/drawingml/2006/main">
+              <a:graphicData uri="http://schemas.openxmlformats.org/drawingml/2006/picture">
+                <pic:pic xmlns:pic="http://schemas.openxmlformats.org/drawingml/2006/picture">
+                  <pic:nvPicPr>
+                    <pic:cNvPr id="0" name="Picture 1"/>
+                    <pic:cNvPicPr>
+                      <a:picLocks noChangeAspect="1" noChangeArrowheads="1"/>
+                    </pic:cNvPicPr>
+                  </pic:nvPicPr>
+                  <pic:blipFill>
+                    <a:blip r:embed="rId5" cstate="print">
+                      <a:extLst>
+                        <a:ext uri="{28A0092B-C50C-407E-A947-70E740481C1C}">
+                          <a14:useLocalDpi xmlns:a14="http://schemas.microsoft.com/office/drawing/2010/main" val="0"/>
+                        </a:ext>
+                      </a:extLst>
+                    </a:blip>
+                    <a:srcRect/>
+                    <a:stretch>
+                      <a:fillRect/>
+                    </a:stretch>
+                  </pic:blipFill>
+                  <pic:spPr bwMode="auto">
+                    <a:xfrm>
+                      <a:off x="0" y="0"/>
+                      <a:ext cx="5721985" cy="2417445"/>
+                    </a:xfrm>
+                    <a:prstGeom prst="rect">
+                      <a:avLst/>
+                    </a:prstGeom>
+                    <a:noFill/>
+                    <a:ln>
+                      <a:noFill/>
+                    </a:ln>
+                  </pic:spPr>
+                </pic:pic>
+              </a:graphicData>
+            </a:graphic>
+          </wp:inline>
+        </w:drawing>
       </w:r>
     </w:p>
     <w:p>
@@ -47,18 +93,62 @@
         <w:t>creenshot</w:t>
       </w:r>
       <w:r>
-        <w:t xml:space="preserve"> 3: Lambda Workspace Deployment</w:t>
+        <w:t xml:space="preserve"> 2: Security Profile Verification</w:t>
       </w:r>
     </w:p>
     <w:p>
       <w:r>
-        <w:t>S</w:t>
-      </w:r>
-      <w:r>
-        <w:t>creenshot</w:t>
-      </w:r>
-      <w:r>
-        <w:t xml:space="preserve"> 4: (Bonus) Cron / EventBridge Mapping</w:t>
+        <w:rPr>
+          <w:noProof/>
+        </w:rPr>
+        <w:drawing>
+          <wp:inline distT="0" distB="0" distL="0" distR="0" wp14:anchorId="281CB267" wp14:editId="6028973C">
+            <wp:extent cx="5721985" cy="2417445"/>
+            <wp:effectExtent l="0" t="0" r="0" b="1905"/>
+            <wp:docPr id="369896268" name="Picture 2"/>
+            <wp:cNvGraphicFramePr>
+              <a:graphicFrameLocks xmlns:a="http://schemas.openxmlformats.org/drawingml/2006/main" noChangeAspect="1"/>
+            </wp:cNvGraphicFramePr>
+            <a:graphic xmlns:a="http://schemas.openxmlformats.org/drawingml/2006/main">
+              <a:graphicData uri="http://schemas.openxmlformats.org/drawingml/2006/picture">
+                <pic:pic xmlns:pic="http://schemas.openxmlformats.org/drawingml/2006/picture">
+                  <pic:nvPicPr>
+                    <pic:cNvPr id="0" name="Picture 2"/>
+                    <pic:cNvPicPr>
+                      <a:picLocks noChangeAspect="1" noChangeArrowheads="1"/>
+                    </pic:cNvPicPr>
+                  </pic:nvPicPr>
+                  <pic:blipFill>
+                    <a:blip r:embed="rId6" cstate="print">
+                      <a:extLst>
+                        <a:ext uri="{28A0092B-C50C-407E-A947-70E740481C1C}">
+                          <a14:useLocalDpi xmlns:a14="http://schemas.microsoft.com/office/drawing/2010/main" val="0"/>
+                        </a:ext>
+                      </a:extLst>
+                    </a:blip>
+                    <a:srcRect/>
+                    <a:stretch>
+                      <a:fillRect/>
+                    </a:stretch>
+                  </pic:blipFill>
+                  <pic:spPr bwMode="auto">
+                    <a:xfrm>
+                      <a:off x="0" y="0"/>
+                      <a:ext cx="5721985" cy="2417445"/>
+                    </a:xfrm>
+                    <a:prstGeom prst="rect">
+                      <a:avLst/>
+                    </a:prstGeom>
+                    <a:noFill/>
+                    <a:ln>
+                      <a:noFill/>
+                    </a:ln>
+                  </pic:spPr>
+                </pic:pic>
+              </a:graphicData>
+            </a:graphic>
+          </wp:inline>
+        </w:drawing>
       </w:r>
     </w:p>
     <w:p>
@@ -69,18 +159,372 @@
         <w:t>creenshot</w:t>
       </w:r>
       <w:r>
-        <w:t xml:space="preserve"> 5: Function Execution &amp; Live Logging Metrics</w:t>
+        <w:t xml:space="preserve"> 3: Lambda Workspace Deployment</w:t>
       </w:r>
     </w:p>
     <w:p>
       <w:r>
+        <w:rPr>
+          <w:noProof/>
+        </w:rPr>
+        <w:lastRenderedPageBreak/>
+        <w:drawing>
+          <wp:inline distT="0" distB="0" distL="0" distR="0" wp14:anchorId="42A34720" wp14:editId="70B26284">
+            <wp:extent cx="5721985" cy="2417445"/>
+            <wp:effectExtent l="0" t="0" r="0" b="1905"/>
+            <wp:docPr id="1799170785" name="Picture 3"/>
+            <wp:cNvGraphicFramePr>
+              <a:graphicFrameLocks xmlns:a="http://schemas.openxmlformats.org/drawingml/2006/main" noChangeAspect="1"/>
+            </wp:cNvGraphicFramePr>
+            <a:graphic xmlns:a="http://schemas.openxmlformats.org/drawingml/2006/main">
+              <a:graphicData uri="http://schemas.openxmlformats.org/drawingml/2006/picture">
+                <pic:pic xmlns:pic="http://schemas.openxmlformats.org/drawingml/2006/picture">
+                  <pic:nvPicPr>
+                    <pic:cNvPr id="0" name="Picture 3"/>
+                    <pic:cNvPicPr>
+                      <a:picLocks noChangeAspect="1" noChangeArrowheads="1"/>
+                    </pic:cNvPicPr>
+                  </pic:nvPicPr>
+                  <pic:blipFill>
+                    <a:blip r:embed="rId7" cstate="print">
+                      <a:extLst>
+                        <a:ext uri="{28A0092B-C50C-407E-A947-70E740481C1C}">
+                          <a14:useLocalDpi xmlns:a14="http://schemas.microsoft.com/office/drawing/2010/main" val="0"/>
+                        </a:ext>
+                      </a:extLst>
+                    </a:blip>
+                    <a:srcRect/>
+                    <a:stretch>
+                      <a:fillRect/>
+                    </a:stretch>
+                  </pic:blipFill>
+                  <pic:spPr bwMode="auto">
+                    <a:xfrm>
+                      <a:off x="0" y="0"/>
+                      <a:ext cx="5721985" cy="2417445"/>
+                    </a:xfrm>
+                    <a:prstGeom prst="rect">
+                      <a:avLst/>
+                    </a:prstGeom>
+                    <a:noFill/>
+                    <a:ln>
+                      <a:noFill/>
+                    </a:ln>
+                  </pic:spPr>
+                </pic:pic>
+              </a:graphicData>
+            </a:graphic>
+          </wp:inline>
+        </w:drawing>
+      </w:r>
+    </w:p>
+    <w:p>
+      <w:r>
+        <w:rPr>
+          <w:noProof/>
+        </w:rPr>
+        <w:drawing>
+          <wp:inline distT="0" distB="0" distL="0" distR="0" wp14:anchorId="7B383A7F" wp14:editId="284B4F90">
+            <wp:extent cx="5721985" cy="2417445"/>
+            <wp:effectExtent l="0" t="0" r="0" b="1905"/>
+            <wp:docPr id="1801066511" name="Picture 4"/>
+            <wp:cNvGraphicFramePr>
+              <a:graphicFrameLocks xmlns:a="http://schemas.openxmlformats.org/drawingml/2006/main" noChangeAspect="1"/>
+            </wp:cNvGraphicFramePr>
+            <a:graphic xmlns:a="http://schemas.openxmlformats.org/drawingml/2006/main">
+              <a:graphicData uri="http://schemas.openxmlformats.org/drawingml/2006/picture">
+                <pic:pic xmlns:pic="http://schemas.openxmlformats.org/drawingml/2006/picture">
+                  <pic:nvPicPr>
+                    <pic:cNvPr id="0" name="Picture 4"/>
+                    <pic:cNvPicPr>
+                      <a:picLocks noChangeAspect="1" noChangeArrowheads="1"/>
+                    </pic:cNvPicPr>
+                  </pic:nvPicPr>
+                  <pic:blipFill>
+                    <a:blip r:embed="rId8" cstate="print">
+                      <a:extLst>
+                        <a:ext uri="{28A0092B-C50C-407E-A947-70E740481C1C}">
+                          <a14:useLocalDpi xmlns:a14="http://schemas.microsoft.com/office/drawing/2010/main" val="0"/>
+                        </a:ext>
+                      </a:extLst>
+                    </a:blip>
+                    <a:srcRect/>
+                    <a:stretch>
+                      <a:fillRect/>
+                    </a:stretch>
+                  </pic:blipFill>
+                  <pic:spPr bwMode="auto">
+                    <a:xfrm>
+                      <a:off x="0" y="0"/>
+                      <a:ext cx="5721985" cy="2417445"/>
+                    </a:xfrm>
+                    <a:prstGeom prst="rect">
+                      <a:avLst/>
+                    </a:prstGeom>
+                    <a:noFill/>
+                    <a:ln>
+                      <a:noFill/>
+                    </a:ln>
+                  </pic:spPr>
+                </pic:pic>
+              </a:graphicData>
+            </a:graphic>
+          </wp:inline>
+        </w:drawing>
+      </w:r>
+    </w:p>
+    <w:p>
+      <w:r>
         <w:t>S</w:t>
       </w:r>
       <w:r>
         <w:t>creenshot</w:t>
       </w:r>
       <w:r>
+        <w:t xml:space="preserve"> 4: (Bonus) Cron / EventBridge Mapping</w:t>
+      </w:r>
+    </w:p>
+    <w:p>
+      <w:r>
+        <w:rPr>
+          <w:noProof/>
+        </w:rPr>
+        <w:drawing>
+          <wp:inline distT="0" distB="0" distL="0" distR="0" wp14:anchorId="7779BAB0" wp14:editId="6DC70884">
+            <wp:extent cx="5721985" cy="2417445"/>
+            <wp:effectExtent l="0" t="0" r="0" b="1905"/>
+            <wp:docPr id="859231982" name="Picture 5"/>
+            <wp:cNvGraphicFramePr>
+              <a:graphicFrameLocks xmlns:a="http://schemas.openxmlformats.org/drawingml/2006/main" noChangeAspect="1"/>
+            </wp:cNvGraphicFramePr>
+            <a:graphic xmlns:a="http://schemas.openxmlformats.org/drawingml/2006/main">
+              <a:graphicData uri="http://schemas.openxmlformats.org/drawingml/2006/picture">
+                <pic:pic xmlns:pic="http://schemas.openxmlformats.org/drawingml/2006/picture">
+                  <pic:nvPicPr>
+                    <pic:cNvPr id="0" name="Picture 5"/>
+                    <pic:cNvPicPr>
+                      <a:picLocks noChangeAspect="1" noChangeArrowheads="1"/>
+                    </pic:cNvPicPr>
+                  </pic:nvPicPr>
+                  <pic:blipFill>
+                    <a:blip r:embed="rId9" cstate="print">
+                      <a:extLst>
+                        <a:ext uri="{28A0092B-C50C-407E-A947-70E740481C1C}">
+                          <a14:useLocalDpi xmlns:a14="http://schemas.microsoft.com/office/drawing/2010/main" val="0"/>
+                        </a:ext>
+                      </a:extLst>
+                    </a:blip>
+                    <a:srcRect/>
+                    <a:stretch>
+                      <a:fillRect/>
+                    </a:stretch>
+                  </pic:blipFill>
+                  <pic:spPr bwMode="auto">
+                    <a:xfrm>
+                      <a:off x="0" y="0"/>
+                      <a:ext cx="5721985" cy="2417445"/>
+                    </a:xfrm>
+                    <a:prstGeom prst="rect">
+                      <a:avLst/>
+                    </a:prstGeom>
+                    <a:noFill/>
+                    <a:ln>
+                      <a:noFill/>
+                    </a:ln>
+                  </pic:spPr>
+                </pic:pic>
+              </a:graphicData>
+            </a:graphic>
+          </wp:inline>
+        </w:drawing>
+      </w:r>
+    </w:p>
+    <w:p>
+      <w:r>
+        <w:rPr>
+          <w:noProof/>
+        </w:rPr>
+        <w:lastRenderedPageBreak/>
+        <w:drawing>
+          <wp:inline distT="0" distB="0" distL="0" distR="0" wp14:anchorId="6D2A7776" wp14:editId="6C443F09">
+            <wp:extent cx="5721985" cy="2417445"/>
+            <wp:effectExtent l="0" t="0" r="0" b="1905"/>
+            <wp:docPr id="1141706143" name="Picture 6"/>
+            <wp:cNvGraphicFramePr>
+              <a:graphicFrameLocks xmlns:a="http://schemas.openxmlformats.org/drawingml/2006/main" noChangeAspect="1"/>
+            </wp:cNvGraphicFramePr>
+            <a:graphic xmlns:a="http://schemas.openxmlformats.org/drawingml/2006/main">
+              <a:graphicData uri="http://schemas.openxmlformats.org/drawingml/2006/picture">
+                <pic:pic xmlns:pic="http://schemas.openxmlformats.org/drawingml/2006/picture">
+                  <pic:nvPicPr>
+                    <pic:cNvPr id="0" name="Picture 6"/>
+                    <pic:cNvPicPr>
+                      <a:picLocks noChangeAspect="1" noChangeArrowheads="1"/>
+                    </pic:cNvPicPr>
+                  </pic:nvPicPr>
+                  <pic:blipFill>
+                    <a:blip r:embed="rId10" cstate="print">
+                      <a:extLst>
+                        <a:ext uri="{28A0092B-C50C-407E-A947-70E740481C1C}">
+                          <a14:useLocalDpi xmlns:a14="http://schemas.microsoft.com/office/drawing/2010/main" val="0"/>
+                        </a:ext>
+                      </a:extLst>
+                    </a:blip>
+                    <a:srcRect/>
+                    <a:stretch>
+                      <a:fillRect/>
+                    </a:stretch>
+                  </pic:blipFill>
+                  <pic:spPr bwMode="auto">
+                    <a:xfrm>
+                      <a:off x="0" y="0"/>
+                      <a:ext cx="5721985" cy="2417445"/>
+                    </a:xfrm>
+                    <a:prstGeom prst="rect">
+                      <a:avLst/>
+                    </a:prstGeom>
+                    <a:noFill/>
+                    <a:ln>
+                      <a:noFill/>
+                    </a:ln>
+                  </pic:spPr>
+                </pic:pic>
+              </a:graphicData>
+            </a:graphic>
+          </wp:inline>
+        </w:drawing>
+      </w:r>
+    </w:p>
+    <w:p>
+      <w:r>
+        <w:t>S</w:t>
+      </w:r>
+      <w:r>
+        <w:t>creenshot</w:t>
+      </w:r>
+      <w:r>
+        <w:t xml:space="preserve"> 5: Function Execution &amp; Live Logging Metrics</w:t>
+      </w:r>
+    </w:p>
+    <w:p>
+      <w:r>
+        <w:rPr>
+          <w:noProof/>
+        </w:rPr>
+        <w:drawing>
+          <wp:inline distT="0" distB="0" distL="0" distR="0" wp14:anchorId="71319932" wp14:editId="5B2A73CF">
+            <wp:extent cx="5721985" cy="2417445"/>
+            <wp:effectExtent l="0" t="0" r="0" b="1905"/>
+            <wp:docPr id="248742363" name="Picture 7"/>
+            <wp:cNvGraphicFramePr>
+              <a:graphicFrameLocks xmlns:a="http://schemas.openxmlformats.org/drawingml/2006/main" noChangeAspect="1"/>
+            </wp:cNvGraphicFramePr>
+            <a:graphic xmlns:a="http://schemas.openxmlformats.org/drawingml/2006/main">
+              <a:graphicData uri="http://schemas.openxmlformats.org/drawingml/2006/picture">
+                <pic:pic xmlns:pic="http://schemas.openxmlformats.org/drawingml/2006/picture">
+                  <pic:nvPicPr>
+                    <pic:cNvPr id="0" name="Picture 7"/>
+                    <pic:cNvPicPr>
+                      <a:picLocks noChangeAspect="1" noChangeArrowheads="1"/>
+                    </pic:cNvPicPr>
+                  </pic:nvPicPr>
+                  <pic:blipFill>
+                    <a:blip r:embed="rId11" cstate="print">
+                      <a:extLst>
+                        <a:ext uri="{28A0092B-C50C-407E-A947-70E740481C1C}">
+                          <a14:useLocalDpi xmlns:a14="http://schemas.microsoft.com/office/drawing/2010/main" val="0"/>
+                        </a:ext>
+                      </a:extLst>
+                    </a:blip>
+                    <a:srcRect/>
+                    <a:stretch>
+                      <a:fillRect/>
+                    </a:stretch>
+                  </pic:blipFill>
+                  <pic:spPr bwMode="auto">
+                    <a:xfrm>
+                      <a:off x="0" y="0"/>
+                      <a:ext cx="5721985" cy="2417445"/>
+                    </a:xfrm>
+                    <a:prstGeom prst="rect">
+                      <a:avLst/>
+                    </a:prstGeom>
+                    <a:noFill/>
+                    <a:ln>
+                      <a:noFill/>
+                    </a:ln>
+                  </pic:spPr>
+                </pic:pic>
+              </a:graphicData>
+            </a:graphic>
+          </wp:inline>
+        </w:drawing>
+      </w:r>
+    </w:p>
+    <w:p>
+      <w:r>
+        <w:t>S</w:t>
+      </w:r>
+      <w:r>
+        <w:t>creenshot</w:t>
+      </w:r>
+      <w:r>
         <w:t xml:space="preserve"> 6: Post-Execution Architecture State</w:t>
+      </w:r>
+    </w:p>
+    <w:p>
+      <w:r>
+        <w:rPr>
+          <w:noProof/>
+        </w:rPr>
+        <w:drawing>
+          <wp:inline distT="0" distB="0" distL="0" distR="0" wp14:anchorId="086C5EAA" wp14:editId="532B3F2D">
+            <wp:extent cx="5721985" cy="2417445"/>
+            <wp:effectExtent l="0" t="0" r="0" b="1905"/>
+            <wp:docPr id="2049550514" name="Picture 8"/>
+            <wp:cNvGraphicFramePr>
+              <a:graphicFrameLocks xmlns:a="http://schemas.openxmlformats.org/drawingml/2006/main" noChangeAspect="1"/>
+            </wp:cNvGraphicFramePr>
+            <a:graphic xmlns:a="http://schemas.openxmlformats.org/drawingml/2006/main">
+              <a:graphicData uri="http://schemas.openxmlformats.org/drawingml/2006/picture">
+                <pic:pic xmlns:pic="http://schemas.openxmlformats.org/drawingml/2006/picture">
+                  <pic:nvPicPr>
+                    <pic:cNvPr id="0" name="Picture 8"/>
+                    <pic:cNvPicPr>
+                      <a:picLocks noChangeAspect="1" noChangeArrowheads="1"/>
+                    </pic:cNvPicPr>
+                  </pic:nvPicPr>
+                  <pic:blipFill>
+                    <a:blip r:embed="rId12" cstate="print">
+                      <a:extLst>
+                        <a:ext uri="{28A0092B-C50C-407E-A947-70E740481C1C}">
+                          <a14:useLocalDpi xmlns:a14="http://schemas.microsoft.com/office/drawing/2010/main" val="0"/>
+                        </a:ext>
+                      </a:extLst>
+                    </a:blip>
+                    <a:srcRect/>
+                    <a:stretch>
+                      <a:fillRect/>
+                    </a:stretch>
+                  </pic:blipFill>
+                  <pic:spPr bwMode="auto">
+                    <a:xfrm>
+                      <a:off x="0" y="0"/>
+                      <a:ext cx="5721985" cy="2417445"/>
+                    </a:xfrm>
+                    <a:prstGeom prst="rect">
+                      <a:avLst/>
+                    </a:prstGeom>
+                    <a:noFill/>
+                    <a:ln>
+                      <a:noFill/>
+                    </a:ln>
+                  </pic:spPr>
+                </pic:pic>
+              </a:graphicData>
+            </a:graphic>
+          </wp:inline>
+        </w:drawing>
       </w:r>
     </w:p>
     <w:sectPr>
@@ -854,6 +1298,7 @@
   <w:style w:type="character" w:default="1" w:styleId="DefaultParagraphFont">
     <w:name w:val="Default Paragraph Font"/>
     <w:uiPriority w:val="1"/>
+    <w:semiHidden/>
     <w:unhideWhenUsed/>
   </w:style>
   <w:style w:type="table" w:default="1" w:styleId="TableNormal">

</xml_diff>